<commit_message>
Use Rafi_Resume_Technical_Architect.docx as canonical resume for all portals
Make the uploaded Technical Architect resume the single source for bootstrap,
Easy Apply label selection, and ATS uploads across LinkedIn/Naukri/Foundit/
Cutshort/Instahyre/Indeed. Keep legacy filenames as same-file aliases.

Co-authored-by: rafi-solibri <rafi-solibri@users.noreply.github.com>
</commit_message>
<xml_diff>
--- a/resumes/Rafi_Resume_Architect.docx
+++ b/resumes/Rafi_Resume_Architect.docx
@@ -25,14 +25,7 @@
         <w:jc w:val="center"/>
       </w:pPr>
       <w:r>
-        <w:rPr>
-          <w:rFonts w:ascii="Calibri" w:cs="Calibri" w:eastAsia="Calibri" w:hAnsi="Calibri"/>
-          <w:b/>
-          <w:bCs/>
-          <w:sz w:val="22"/>
-          <w:szCs w:val="22"/>
-        </w:rPr>
-        <w:t xml:space="preserve">Solutions Architect | Technical Lead — .NET, Cloud &amp; Distributed Systems</w:t>
+        <w:t>Technical Architect | Technical Lead — .NET, Cloud &amp; Distributed Systems</w:t>
       </w:r>
     </w:p>
     <w:p>
@@ -76,12 +69,7 @@
         <w:spacing w:after="150"/>
       </w:pPr>
       <w:r>
-        <w:rPr>
-          <w:rFonts w:ascii="Calibri" w:cs="Calibri" w:eastAsia="Calibri" w:hAnsi="Calibri"/>
-          <w:sz w:val="20"/>
-          <w:szCs w:val="20"/>
-        </w:rPr>
-        <w:t xml:space="preserve">Solutions Architect and Technical Lead with 15+ years designing distributed, cloud-native platforms and leading engineering teams to deliver them, across healthcare, retail, and telecom. Owns end-to-end architecture decisions across service boundaries, API contracts, event-driven messaging (Kafka/RabbitMQ), data models, and deployment topology on AWS and Azure, spanning multiple internal and partner-facing systems. Equally comfortable leading cross-functional engineering teams day-to-day — setting technical direction, running code reviews, mentoring engineers, and owning delivery through CI/CD. Deep hands-on background in .NET Core, C#, and Kubernetes/Docker-based deployment, with a track record translating business requirements into scalable, maintainable system design and shipped software.</w:t>
+        <w:t>Technical Architect and Technical Lead with 15+ years designing distributed, cloud-native platforms and leading engineering teams to deliver them, across healthcare, retail, and telecom. Owns end-to-end architecture decisions across service boundaries, API contracts, event-driven messaging (Kafka/RabbitMQ), data models, and deployment topology on AWS and Azure, spanning multiple internal and partner-facing systems. Equally comfortable leading cross-functional engineering teams day-to-day — setting technical direction, running code reviews, mentoring engineers, and owning delivery through CI/CD. Deep hands-on background in .NET Core, C#, and Kubernetes/Docker-based deployment, with a track record translating business requirements into scalable, maintainable system design and shipped software.</w:t>
       </w:r>
     </w:p>
     <w:p>
@@ -219,24 +207,7 @@
         <w:spacing w:after="40" w:before="150"/>
       </w:pPr>
       <w:r>
-        <w:rPr>
-          <w:rFonts w:ascii="Calibri" w:cs="Calibri" w:eastAsia="Calibri" w:hAnsi="Calibri"/>
-          <w:b/>
-          <w:bCs/>
-          <w:sz w:val="21"/>
-          <w:szCs w:val="21"/>
-        </w:rPr>
-        <w:t xml:space="preserve">Principal Analyst (Solutions Architect) — Nemetschek</w:t>
-      </w:r>
-      <w:r>
-        <w:rPr>
-          <w:rFonts w:ascii="Calibri" w:cs="Calibri" w:eastAsia="Calibri" w:hAnsi="Calibri"/>
-          <w:i/>
-          <w:iCs/>
-          <w:sz w:val="20"/>
-          <w:szCs w:val="20"/>
-        </w:rPr>
-        <w:t xml:space="preserve">   Apr 2024 – Present</w:t>
+        <w:t>Principal Analyst (Technical Architect) — Nemetschek   Apr 2024 – Present</w:t>
       </w:r>
     </w:p>
     <w:p>
@@ -316,24 +287,7 @@
         <w:spacing w:after="40" w:before="150"/>
       </w:pPr>
       <w:r>
-        <w:rPr>
-          <w:rFonts w:ascii="Calibri" w:cs="Calibri" w:eastAsia="Calibri" w:hAnsi="Calibri"/>
-          <w:b/>
-          <w:bCs/>
-          <w:sz w:val="21"/>
-          <w:szCs w:val="21"/>
-        </w:rPr>
-        <w:t xml:space="preserve">PS IV Engineer (Solutions Architect) — NCR</w:t>
-      </w:r>
-      <w:r>
-        <w:rPr>
-          <w:rFonts w:ascii="Calibri" w:cs="Calibri" w:eastAsia="Calibri" w:hAnsi="Calibri"/>
-          <w:i/>
-          <w:iCs/>
-          <w:sz w:val="20"/>
-          <w:szCs w:val="20"/>
-        </w:rPr>
-        <w:t xml:space="preserve">   Jul 2023 – Feb 2024</w:t>
+        <w:t>PS IV Engineer (Technical Architect) — NCR   Jul 2023 – Feb 2024</w:t>
       </w:r>
     </w:p>
     <w:p>

</xml_diff>